<commit_message>
feat(kyctapp): motion and petition regenerated on the shared model at HEAD and gated (docx XENG passes; latex reported: "* * *" text, a break before an em dash) (fb-595.54.55)
Co-Authored-By: Claude Opus 5.5 <noreply@anthropic.com>
</commit_message>
<xml_diff>
--- a/courts/sixth-circuit/kentucky/state/court-of-appeals/motion-brief/usage/OUTPUT-motion-brief.docx
+++ b/courts/sixth-circuit/kentucky/state/court-of-appeals/motion-brief/usage/OUTPUT-motion-brief.docx
@@ -1179,7 +1179,7 @@
         <w:t xml:space="preserve"> </w:t>
       </w:r>
       <w:r>
-        <w:t xml:space="preserve">KRS 311.772 (the Human Life Protection Act), .7701–11 (the Heartbeat Law). Once an abortion has been performed, the life of that unborn child is over. No court order can bring that child back. To be sure, there are instances in which timing matters for an expectant mother who requires an abortion because her life is in danger. And the General Assembly has protected that expectant mother in such circumstances.</w:t>
+        <w:t xml:space="preserve">KRS 311.772 (the Human Life Protection Act), .7701–11 (the Heartbeat Law). Once an abortion has been performed, the life of that unborn child is over. No court order can bring that child back. To be sure, there are instances in which timing matters for an expectant mother who requires an abortion because her life is in danger. And the General Assembly has protected that expectant mother in such circumstances.</w:t>
       </w:r>
       <w:r>
         <w:t xml:space="preserve"> </w:t>
@@ -1195,7 +1195,7 @@
         <w:t xml:space="preserve"> </w:t>
       </w:r>
       <w:r>
-        <w:t xml:space="preserve">KRS 311.772(4)⁠(a), .7705(2), .7706(2). So all the temporary injunction does here is ensure that the Commonwealth, the Attorney General, and the public must bear the irreparable harm of Kentucky’s laws going unenforced. And even more troubling, the temporary injunction guarantees that unborn lives will be lost while the underlying litigation proceeds. If that is not the kind of irreparable harm contemplated by CR 65.07(6), what is?</w:t>
+        <w:t xml:space="preserve">KRS 311.772(4)⁠(a), .7705(2), .7706(2). So all the temporary injunction does here is ensure that the Commonwealth, the Attorney General, and the public must bear the irreparable harm of Kentucky’s laws going unenforced. And even more troubling, the temporary injunction guarantees that unborn lives will be lost while the underlying litigation proceeds. If that is not the kind of irreparable harm contemplated by CR 65.07(6), what is?</w:t>
       </w:r>
     </w:p>
     <w:p>
@@ -1345,7 +1345,7 @@
         <w:pStyle w:val="BodyText"/>
       </w:pPr>
       <w:r>
-        <w:t xml:space="preserve">To the extent the Court is concerned with the effect of its order on third parties (such as pregnant women who might need to terminate a pregnancy due to health risks), those concerns have already been addressed by the General Assembly. Both the Human Life Protection Act and the Heartbeat Law give clinicians flexibility to act to protect the health and safety of an expectant mother. KRS 311.772(4), .7705(2), .7706(2). And so the only irreparable harm that has been clearly established in this case is the harm to the public and the Commonwealth from non-enforcement of these two duly enacted statutes.</w:t>
+        <w:t xml:space="preserve">To the extent the Court is concerned with the effect of its order on third parties (such as pregnant women who might need to terminate a pregnancy due to health risks), those concerns have already been addressed by the General Assembly. Both the Human Life Protection Act and the Heartbeat Law give clinicians flexibility to act to protect the health and safety of an expectant mother. KRS 311.772(4), .7705(2), .7706(2). And so the only irreparable harm that has been clearly established in this case is the harm to the public and the Commonwealth from non-enforcement of these two duly enacted statutes.</w:t>
       </w:r>
       <w:r>
         <w:t xml:space="preserve"> </w:t>
@@ -4559,6 +4559,7 @@
     <w:unhideWhenUsed/>
     <w:qFormat/>
     <w:pPr>
+      <w:keepLines/>
       <w:spacing w:before="0" w:after="140" w:line="276" w:lineRule="exact"/>
     </w:pPr>
     <w:rPr>
@@ -4809,6 +4810,33 @@
     <w:pPr>
       <w:spacing w:before="0" w:after="0" w:line="276" w:lineRule="exact"/>
       <w:ind w:left="2160" w:hanging="720"/>
+    </w:pPr>
+  </w:style>
+  <w:style w:type="paragraph" w:customStyle="1" w:styleId="XdQuoteList1">
+    <w:name w:val="Xd Quote List 1"/>
+    <w:basedOn w:val="Normal"/>
+    <w:qFormat/>
+    <w:pPr>
+      <w:spacing w:before="0" w:after="0" w:line="276" w:lineRule="exact"/>
+      <w:ind w:left="1440" w:right="720" w:hanging="720"/>
+    </w:pPr>
+  </w:style>
+  <w:style w:type="paragraph" w:customStyle="1" w:styleId="XdQuoteList2">
+    <w:name w:val="Xd Quote List 2"/>
+    <w:basedOn w:val="Normal"/>
+    <w:qFormat/>
+    <w:pPr>
+      <w:spacing w:before="0" w:after="0" w:line="276" w:lineRule="exact"/>
+      <w:ind w:left="2160" w:right="720" w:hanging="720"/>
+    </w:pPr>
+  </w:style>
+  <w:style w:type="paragraph" w:customStyle="1" w:styleId="XdQuoteList3">
+    <w:name w:val="Xd Quote List 3"/>
+    <w:basedOn w:val="Normal"/>
+    <w:qFormat/>
+    <w:pPr>
+      <w:spacing w:before="0" w:after="0" w:line="276" w:lineRule="exact"/>
+      <w:ind w:left="2880" w:right="720" w:hanging="720"/>
     </w:pPr>
   </w:style>
   <w:style w:type="paragraph" w:customStyle="1" w:styleId="SourceCode">

</xml_diff>